<commit_message>
added updated reasoning document and incremental analysis
</commit_message>
<xml_diff>
--- a/ImprovedCDS/CDS_FINAL/CDS_Incremental_analysis/CDS_Incremental_Analysis_Report.docx
+++ b/ImprovedCDS/CDS_FINAL/CDS_Incremental_analysis/CDS_Incremental_Analysis_Report.docx
@@ -661,7 +661,7 @@
               <a:graphicData uri="http://schemas.openxmlformats.org/drawingml/2006/picture">
                 <pic:pic>
                   <pic:nvPicPr>
-                    <pic:cNvPr id="0" name="cds_chart_u1jsan2o.png"/>
+                    <pic:cNvPr id="0" name="cds_chart_ykdn_2bb.png"/>
                     <pic:cNvPicPr/>
                   </pic:nvPicPr>
                   <pic:blipFill>
@@ -981,7 +981,7 @@
               <a:graphicData uri="http://schemas.openxmlformats.org/drawingml/2006/picture">
                 <pic:pic>
                   <pic:nvPicPr>
-                    <pic:cNvPr id="0" name="cds_chart_d7tbfx88.png"/>
+                    <pic:cNvPr id="0" name="cds_chart_tdf9w6x4.png"/>
                     <pic:cNvPicPr/>
                   </pic:nvPicPr>
                   <pic:blipFill>
@@ -1312,7 +1312,7 @@
               <a:graphicData uri="http://schemas.openxmlformats.org/drawingml/2006/picture">
                 <pic:pic>
                   <pic:nvPicPr>
-                    <pic:cNvPr id="0" name="cds_chart_h4_m3ftq.png"/>
+                    <pic:cNvPr id="0" name="cds_chart_tzwijk18.png"/>
                     <pic:cNvPicPr/>
                   </pic:nvPicPr>
                   <pic:blipFill>
@@ -1643,7 +1643,7 @@
               <a:graphicData uri="http://schemas.openxmlformats.org/drawingml/2006/picture">
                 <pic:pic>
                   <pic:nvPicPr>
-                    <pic:cNvPr id="0" name="cds_chart_j5aqbo4m.png"/>
+                    <pic:cNvPr id="0" name="cds_chart_hsbjk5kp.png"/>
                     <pic:cNvPicPr/>
                   </pic:nvPicPr>
                   <pic:blipFill>
@@ -2244,7 +2244,7 @@
               <a:graphicData uri="http://schemas.openxmlformats.org/drawingml/2006/picture">
                 <pic:pic>
                   <pic:nvPicPr>
-                    <pic:cNvPr id="0" name="cds_chart_lgcko4ic.png"/>
+                    <pic:cNvPr id="0" name="cds_chart_kybxt299.png"/>
                     <pic:cNvPicPr/>
                   </pic:nvPicPr>
                   <pic:blipFill>
@@ -2575,7 +2575,7 @@
               <a:graphicData uri="http://schemas.openxmlformats.org/drawingml/2006/picture">
                 <pic:pic>
                   <pic:nvPicPr>
-                    <pic:cNvPr id="0" name="cds_chart_aqzvkbod.png"/>
+                    <pic:cNvPr id="0" name="cds_chart_i717e9e5.png"/>
                     <pic:cNvPicPr/>
                   </pic:nvPicPr>
                   <pic:blipFill>
@@ -3468,7 +3468,7 @@
               <a:graphicData uri="http://schemas.openxmlformats.org/drawingml/2006/picture">
                 <pic:pic>
                   <pic:nvPicPr>
-                    <pic:cNvPr id="0" name="cds_chart_hvgfky1e.png"/>
+                    <pic:cNvPr id="0" name="cds_chart_ad6digpg.png"/>
                     <pic:cNvPicPr/>
                   </pic:nvPicPr>
                   <pic:blipFill>
@@ -4080,7 +4080,7 @@
               <a:graphicData uri="http://schemas.openxmlformats.org/drawingml/2006/picture">
                 <pic:pic>
                   <pic:nvPicPr>
-                    <pic:cNvPr id="0" name="cds_chart_ybvfyy13.png"/>
+                    <pic:cNvPr id="0" name="cds_chart_3i74gx_i.png"/>
                     <pic:cNvPicPr/>
                   </pic:nvPicPr>
                   <pic:blipFill>
@@ -4209,7 +4209,7 @@
           <w:color w:val="1F2D5C"/>
           <w:sz w:val="32"/>
         </w:rPr>
-        <w:t>17. LOOCV with All Classes (Placeholder)</w:t>
+        <w:t>17. LOOCV with All Classes</w:t>
       </w:r>
     </w:p>
     <w:p>
@@ -4217,10 +4217,859 @@
         <w:rPr>
           <w:rFonts w:ascii="Calibri" w:hAnsi="Calibri"/>
           <w:b w:val="0"/>
-          <w:i/>
+          <w:i w:val="0"/>
           <w:sz w:val="22"/>
         </w:rPr>
-        <w:t>LOOCV results with all 13 classes (no class removal) are being computed. Preliminary results at 100/452 iterations show approximately 85.0% accuracy. Full results will be added upon completion.</w:t>
+        <w:t>To evaluate the final algorithm's robustness under the most rigorous validation scheme, Leave-One-Out Cross-Validation (LOOCV) was performed on the full 452-patient dataset with all 13 disease classes retained (no class removal). In LOOCV, each patient is predicted using a model trained on the remaining 451 patients, yielding an unbiased estimate of generalization performance.</w:t>
+      </w:r>
+    </w:p>
+    <w:p>
+      <w:r>
+        <w:rPr>
+          <w:rFonts w:ascii="Calibri" w:hAnsi="Calibri"/>
+          <w:b w:val="0"/>
+          <w:i w:val="0"/>
+          <w:sz w:val="22"/>
+        </w:rPr>
+      </w:r>
+    </w:p>
+    <w:tbl>
+      <w:tblPr>
+        <w:tblStyle w:val="TableGrid"/>
+        <w:tblW w:type="auto" w:w="0"/>
+        <w:jc w:val="center"/>
+        <w:tblLook w:firstColumn="1" w:firstRow="1" w:lastColumn="0" w:lastRow="0" w:noHBand="0" w:noVBand="1" w:val="04A0"/>
+      </w:tblPr>
+      <w:tblGrid>
+        <w:gridCol w:w="4680"/>
+        <w:gridCol w:w="4680"/>
+      </w:tblGrid>
+      <w:tr>
+        <w:tc>
+          <w:tcPr>
+            <w:tcW w:type="dxa" w:w="4680"/>
+            <w:shd w:val="clear" w:color="auto" w:fill="1F3864"/>
+          </w:tcPr>
+          <w:p>
+            <w:r>
+              <w:rPr>
+                <w:b/>
+                <w:color w:val="FFFFFF"/>
+              </w:rPr>
+              <w:t>Metric</w:t>
+            </w:r>
+          </w:p>
+        </w:tc>
+        <w:tc>
+          <w:tcPr>
+            <w:tcW w:type="dxa" w:w="4680"/>
+            <w:shd w:val="clear" w:color="auto" w:fill="1F3864"/>
+          </w:tcPr>
+          <w:p>
+            <w:r>
+              <w:rPr>
+                <w:b/>
+                <w:color w:val="FFFFFF"/>
+              </w:rPr>
+              <w:t>Result</w:t>
+            </w:r>
+          </w:p>
+        </w:tc>
+      </w:tr>
+      <w:tr>
+        <w:tc>
+          <w:tcPr>
+            <w:tcW w:type="dxa" w:w="4680"/>
+          </w:tcPr>
+          <w:p>
+            <w:r>
+              <w:t>Multiclass Accuracy</w:t>
+            </w:r>
+          </w:p>
+        </w:tc>
+        <w:tc>
+          <w:tcPr>
+            <w:tcW w:type="dxa" w:w="4680"/>
+          </w:tcPr>
+          <w:p>
+            <w:r>
+              <w:t>78.3%</w:t>
+            </w:r>
+          </w:p>
+        </w:tc>
+      </w:tr>
+      <w:tr>
+        <w:tc>
+          <w:tcPr>
+            <w:tcW w:type="dxa" w:w="4680"/>
+          </w:tcPr>
+          <w:p>
+            <w:r>
+              <w:t>Binary Accuracy (Healthy vs Disease)</w:t>
+            </w:r>
+          </w:p>
+        </w:tc>
+        <w:tc>
+          <w:tcPr>
+            <w:tcW w:type="dxa" w:w="4680"/>
+          </w:tcPr>
+          <w:p>
+            <w:r>
+              <w:t>85.0%</w:t>
+            </w:r>
+          </w:p>
+        </w:tc>
+      </w:tr>
+      <w:tr>
+        <w:tc>
+          <w:tcPr>
+            <w:tcW w:type="dxa" w:w="4680"/>
+          </w:tcPr>
+          <w:p>
+            <w:r>
+              <w:t>Specificity</w:t>
+            </w:r>
+          </w:p>
+        </w:tc>
+        <w:tc>
+          <w:tcPr>
+            <w:tcW w:type="dxa" w:w="4680"/>
+          </w:tcPr>
+          <w:p>
+            <w:r>
+              <w:t>88.6%</w:t>
+            </w:r>
+          </w:p>
+        </w:tc>
+      </w:tr>
+      <w:tr>
+        <w:tc>
+          <w:tcPr>
+            <w:tcW w:type="dxa" w:w="4680"/>
+          </w:tcPr>
+          <w:p>
+            <w:r>
+              <w:t>Sensitivity</w:t>
+            </w:r>
+          </w:p>
+        </w:tc>
+        <w:tc>
+          <w:tcPr>
+            <w:tcW w:type="dxa" w:w="4680"/>
+          </w:tcPr>
+          <w:p>
+            <w:r>
+              <w:t>80.7%</w:t>
+            </w:r>
+          </w:p>
+        </w:tc>
+      </w:tr>
+      <w:tr>
+        <w:tc>
+          <w:tcPr>
+            <w:tcW w:type="dxa" w:w="4680"/>
+          </w:tcPr>
+          <w:p>
+            <w:r>
+              <w:t>Balanced Accuracy</w:t>
+            </w:r>
+          </w:p>
+        </w:tc>
+        <w:tc>
+          <w:tcPr>
+            <w:tcW w:type="dxa" w:w="4680"/>
+          </w:tcPr>
+          <w:p>
+            <w:r>
+              <w:t>53.5%</w:t>
+            </w:r>
+          </w:p>
+        </w:tc>
+      </w:tr>
+    </w:tbl>
+    <w:p>
+      <w:r>
+        <w:rPr>
+          <w:rFonts w:ascii="Calibri" w:hAnsi="Calibri"/>
+          <w:b w:val="0"/>
+          <w:i w:val="0"/>
+          <w:sz w:val="22"/>
+        </w:rPr>
+      </w:r>
+    </w:p>
+    <w:p>
+      <w:r>
+        <w:rPr>
+          <w:rFonts w:ascii="Calibri" w:hAnsi="Calibri"/>
+          <w:b w:val="0"/>
+          <w:i w:val="0"/>
+          <w:sz w:val="22"/>
+        </w:rPr>
+        <w:t>The 78.3% multiclass accuracy across all 13 classes is noteworthy given that five of those classes (7, 8, 11, 12, 13) have extremely small sample sizes (2–5 patients each). The binary accuracy of 85.0% demonstrates strong healthy-vs-disease discrimination even without class removal. The per-class breakdown reveals clear patterns:</w:t>
+      </w:r>
+    </w:p>
+    <w:p>
+      <w:r>
+        <w:rPr>
+          <w:rFonts w:ascii="Calibri" w:hAnsi="Calibri"/>
+          <w:b w:val="0"/>
+          <w:i w:val="0"/>
+          <w:sz w:val="22"/>
+        </w:rPr>
+      </w:r>
+    </w:p>
+    <w:tbl>
+      <w:tblPr>
+        <w:tblStyle w:val="TableGrid"/>
+        <w:tblW w:type="auto" w:w="0"/>
+        <w:jc w:val="center"/>
+        <w:tblLook w:firstColumn="1" w:firstRow="1" w:lastColumn="0" w:lastRow="0" w:noHBand="0" w:noVBand="1" w:val="04A0"/>
+      </w:tblPr>
+      <w:tblGrid>
+        <w:gridCol w:w="2340"/>
+        <w:gridCol w:w="2340"/>
+        <w:gridCol w:w="2340"/>
+        <w:gridCol w:w="2340"/>
+      </w:tblGrid>
+      <w:tr>
+        <w:tc>
+          <w:tcPr>
+            <w:tcW w:type="dxa" w:w="2340"/>
+            <w:shd w:val="clear" w:color="auto" w:fill="1F3864"/>
+          </w:tcPr>
+          <w:p>
+            <w:r>
+              <w:rPr>
+                <w:b/>
+                <w:color w:val="FFFFFF"/>
+              </w:rPr>
+              <w:t>Class</w:t>
+            </w:r>
+          </w:p>
+        </w:tc>
+        <w:tc>
+          <w:tcPr>
+            <w:tcW w:type="dxa" w:w="2340"/>
+            <w:shd w:val="clear" w:color="auto" w:fill="1F3864"/>
+          </w:tcPr>
+          <w:p>
+            <w:r>
+              <w:rPr>
+                <w:b/>
+                <w:color w:val="FFFFFF"/>
+              </w:rPr>
+              <w:t>Count</w:t>
+            </w:r>
+          </w:p>
+        </w:tc>
+        <w:tc>
+          <w:tcPr>
+            <w:tcW w:type="dxa" w:w="2340"/>
+            <w:shd w:val="clear" w:color="auto" w:fill="1F3864"/>
+          </w:tcPr>
+          <w:p>
+            <w:r>
+              <w:rPr>
+                <w:b/>
+                <w:color w:val="FFFFFF"/>
+              </w:rPr>
+              <w:t>Correct</w:t>
+            </w:r>
+          </w:p>
+        </w:tc>
+        <w:tc>
+          <w:tcPr>
+            <w:tcW w:type="dxa" w:w="2340"/>
+            <w:shd w:val="clear" w:color="auto" w:fill="1F3864"/>
+          </w:tcPr>
+          <w:p>
+            <w:r>
+              <w:rPr>
+                <w:b/>
+                <w:color w:val="FFFFFF"/>
+              </w:rPr>
+              <w:t>Accuracy</w:t>
+            </w:r>
+          </w:p>
+        </w:tc>
+      </w:tr>
+      <w:tr>
+        <w:tc>
+          <w:tcPr>
+            <w:tcW w:type="dxa" w:w="2340"/>
+          </w:tcPr>
+          <w:p>
+            <w:r>
+              <w:t>1 (Healthy)</w:t>
+            </w:r>
+          </w:p>
+        </w:tc>
+        <w:tc>
+          <w:tcPr>
+            <w:tcW w:type="dxa" w:w="2340"/>
+          </w:tcPr>
+          <w:p>
+            <w:r>
+              <w:t>245</w:t>
+            </w:r>
+          </w:p>
+        </w:tc>
+        <w:tc>
+          <w:tcPr>
+            <w:tcW w:type="dxa" w:w="2340"/>
+          </w:tcPr>
+          <w:p>
+            <w:r>
+              <w:t>217</w:t>
+            </w:r>
+          </w:p>
+        </w:tc>
+        <w:tc>
+          <w:tcPr>
+            <w:tcW w:type="dxa" w:w="2340"/>
+          </w:tcPr>
+          <w:p>
+            <w:r>
+              <w:t>88.6%</w:t>
+            </w:r>
+          </w:p>
+        </w:tc>
+      </w:tr>
+      <w:tr>
+        <w:tc>
+          <w:tcPr>
+            <w:tcW w:type="dxa" w:w="2340"/>
+          </w:tcPr>
+          <w:p>
+            <w:r>
+              <w:t>2</w:t>
+            </w:r>
+          </w:p>
+        </w:tc>
+        <w:tc>
+          <w:tcPr>
+            <w:tcW w:type="dxa" w:w="2340"/>
+          </w:tcPr>
+          <w:p>
+            <w:r>
+              <w:t>44</w:t>
+            </w:r>
+          </w:p>
+        </w:tc>
+        <w:tc>
+          <w:tcPr>
+            <w:tcW w:type="dxa" w:w="2340"/>
+          </w:tcPr>
+          <w:p>
+            <w:r>
+              <w:t>34</w:t>
+            </w:r>
+          </w:p>
+        </w:tc>
+        <w:tc>
+          <w:tcPr>
+            <w:tcW w:type="dxa" w:w="2340"/>
+          </w:tcPr>
+          <w:p>
+            <w:r>
+              <w:t>77.3%</w:t>
+            </w:r>
+          </w:p>
+        </w:tc>
+      </w:tr>
+      <w:tr>
+        <w:tc>
+          <w:tcPr>
+            <w:tcW w:type="dxa" w:w="2340"/>
+          </w:tcPr>
+          <w:p>
+            <w:r>
+              <w:t>3</w:t>
+            </w:r>
+          </w:p>
+        </w:tc>
+        <w:tc>
+          <w:tcPr>
+            <w:tcW w:type="dxa" w:w="2340"/>
+          </w:tcPr>
+          <w:p>
+            <w:r>
+              <w:t>15</w:t>
+            </w:r>
+          </w:p>
+        </w:tc>
+        <w:tc>
+          <w:tcPr>
+            <w:tcW w:type="dxa" w:w="2340"/>
+          </w:tcPr>
+          <w:p>
+            <w:r>
+              <w:t>14</w:t>
+            </w:r>
+          </w:p>
+        </w:tc>
+        <w:tc>
+          <w:tcPr>
+            <w:tcW w:type="dxa" w:w="2340"/>
+          </w:tcPr>
+          <w:p>
+            <w:r>
+              <w:t>93.3%</w:t>
+            </w:r>
+          </w:p>
+        </w:tc>
+      </w:tr>
+      <w:tr>
+        <w:tc>
+          <w:tcPr>
+            <w:tcW w:type="dxa" w:w="2340"/>
+          </w:tcPr>
+          <w:p>
+            <w:r>
+              <w:t>4</w:t>
+            </w:r>
+          </w:p>
+        </w:tc>
+        <w:tc>
+          <w:tcPr>
+            <w:tcW w:type="dxa" w:w="2340"/>
+          </w:tcPr>
+          <w:p>
+            <w:r>
+              <w:t>15</w:t>
+            </w:r>
+          </w:p>
+        </w:tc>
+        <w:tc>
+          <w:tcPr>
+            <w:tcW w:type="dxa" w:w="2340"/>
+          </w:tcPr>
+          <w:p>
+            <w:r>
+              <w:t>12</w:t>
+            </w:r>
+          </w:p>
+        </w:tc>
+        <w:tc>
+          <w:tcPr>
+            <w:tcW w:type="dxa" w:w="2340"/>
+          </w:tcPr>
+          <w:p>
+            <w:r>
+              <w:t>80.0%</w:t>
+            </w:r>
+          </w:p>
+        </w:tc>
+      </w:tr>
+      <w:tr>
+        <w:tc>
+          <w:tcPr>
+            <w:tcW w:type="dxa" w:w="2340"/>
+          </w:tcPr>
+          <w:p>
+            <w:r>
+              <w:t>5</w:t>
+            </w:r>
+          </w:p>
+        </w:tc>
+        <w:tc>
+          <w:tcPr>
+            <w:tcW w:type="dxa" w:w="2340"/>
+          </w:tcPr>
+          <w:p>
+            <w:r>
+              <w:t>13</w:t>
+            </w:r>
+          </w:p>
+        </w:tc>
+        <w:tc>
+          <w:tcPr>
+            <w:tcW w:type="dxa" w:w="2340"/>
+          </w:tcPr>
+          <w:p>
+            <w:r>
+              <w:t>7</w:t>
+            </w:r>
+          </w:p>
+        </w:tc>
+        <w:tc>
+          <w:tcPr>
+            <w:tcW w:type="dxa" w:w="2340"/>
+          </w:tcPr>
+          <w:p>
+            <w:r>
+              <w:t>53.8%</w:t>
+            </w:r>
+          </w:p>
+        </w:tc>
+      </w:tr>
+      <w:tr>
+        <w:tc>
+          <w:tcPr>
+            <w:tcW w:type="dxa" w:w="2340"/>
+          </w:tcPr>
+          <w:p>
+            <w:r>
+              <w:t>6</w:t>
+            </w:r>
+          </w:p>
+        </w:tc>
+        <w:tc>
+          <w:tcPr>
+            <w:tcW w:type="dxa" w:w="2340"/>
+          </w:tcPr>
+          <w:p>
+            <w:r>
+              <w:t>25</w:t>
+            </w:r>
+          </w:p>
+        </w:tc>
+        <w:tc>
+          <w:tcPr>
+            <w:tcW w:type="dxa" w:w="2340"/>
+          </w:tcPr>
+          <w:p>
+            <w:r>
+              <w:t>22</w:t>
+            </w:r>
+          </w:p>
+        </w:tc>
+        <w:tc>
+          <w:tcPr>
+            <w:tcW w:type="dxa" w:w="2340"/>
+          </w:tcPr>
+          <w:p>
+            <w:r>
+              <w:t>88.0%</w:t>
+            </w:r>
+          </w:p>
+        </w:tc>
+      </w:tr>
+      <w:tr>
+        <w:tc>
+          <w:tcPr>
+            <w:tcW w:type="dxa" w:w="2340"/>
+          </w:tcPr>
+          <w:p>
+            <w:r>
+              <w:t>7</w:t>
+            </w:r>
+          </w:p>
+        </w:tc>
+        <w:tc>
+          <w:tcPr>
+            <w:tcW w:type="dxa" w:w="2340"/>
+          </w:tcPr>
+          <w:p>
+            <w:r>
+              <w:t>3</w:t>
+            </w:r>
+          </w:p>
+        </w:tc>
+        <w:tc>
+          <w:tcPr>
+            <w:tcW w:type="dxa" w:w="2340"/>
+          </w:tcPr>
+          <w:p>
+            <w:r>
+              <w:t>0</w:t>
+            </w:r>
+          </w:p>
+        </w:tc>
+        <w:tc>
+          <w:tcPr>
+            <w:tcW w:type="dxa" w:w="2340"/>
+          </w:tcPr>
+          <w:p>
+            <w:r>
+              <w:t>0.0%</w:t>
+            </w:r>
+          </w:p>
+        </w:tc>
+      </w:tr>
+      <w:tr>
+        <w:tc>
+          <w:tcPr>
+            <w:tcW w:type="dxa" w:w="2340"/>
+          </w:tcPr>
+          <w:p>
+            <w:r>
+              <w:t>8</w:t>
+            </w:r>
+          </w:p>
+        </w:tc>
+        <w:tc>
+          <w:tcPr>
+            <w:tcW w:type="dxa" w:w="2340"/>
+          </w:tcPr>
+          <w:p>
+            <w:r>
+              <w:t>2</w:t>
+            </w:r>
+          </w:p>
+        </w:tc>
+        <w:tc>
+          <w:tcPr>
+            <w:tcW w:type="dxa" w:w="2340"/>
+          </w:tcPr>
+          <w:p>
+            <w:r>
+              <w:t>0</w:t>
+            </w:r>
+          </w:p>
+        </w:tc>
+        <w:tc>
+          <w:tcPr>
+            <w:tcW w:type="dxa" w:w="2340"/>
+          </w:tcPr>
+          <w:p>
+            <w:r>
+              <w:t>0.0%</w:t>
+            </w:r>
+          </w:p>
+        </w:tc>
+      </w:tr>
+      <w:tr>
+        <w:tc>
+          <w:tcPr>
+            <w:tcW w:type="dxa" w:w="2340"/>
+          </w:tcPr>
+          <w:p>
+            <w:r>
+              <w:t>9</w:t>
+            </w:r>
+          </w:p>
+        </w:tc>
+        <w:tc>
+          <w:tcPr>
+            <w:tcW w:type="dxa" w:w="2340"/>
+          </w:tcPr>
+          <w:p>
+            <w:r>
+              <w:t>9</w:t>
+            </w:r>
+          </w:p>
+        </w:tc>
+        <w:tc>
+          <w:tcPr>
+            <w:tcW w:type="dxa" w:w="2340"/>
+          </w:tcPr>
+          <w:p>
+            <w:r>
+              <w:t>9</w:t>
+            </w:r>
+          </w:p>
+        </w:tc>
+        <w:tc>
+          <w:tcPr>
+            <w:tcW w:type="dxa" w:w="2340"/>
+          </w:tcPr>
+          <w:p>
+            <w:r>
+              <w:t>100.0%</w:t>
+            </w:r>
+          </w:p>
+        </w:tc>
+      </w:tr>
+      <w:tr>
+        <w:tc>
+          <w:tcPr>
+            <w:tcW w:type="dxa" w:w="2340"/>
+          </w:tcPr>
+          <w:p>
+            <w:r>
+              <w:t>10</w:t>
+            </w:r>
+          </w:p>
+        </w:tc>
+        <w:tc>
+          <w:tcPr>
+            <w:tcW w:type="dxa" w:w="2340"/>
+          </w:tcPr>
+          <w:p>
+            <w:r>
+              <w:t>50</w:t>
+            </w:r>
+          </w:p>
+        </w:tc>
+        <w:tc>
+          <w:tcPr>
+            <w:tcW w:type="dxa" w:w="2340"/>
+          </w:tcPr>
+          <w:p>
+            <w:r>
+              <w:t>37</w:t>
+            </w:r>
+          </w:p>
+        </w:tc>
+        <w:tc>
+          <w:tcPr>
+            <w:tcW w:type="dxa" w:w="2340"/>
+          </w:tcPr>
+          <w:p>
+            <w:r>
+              <w:t>74.0%</w:t>
+            </w:r>
+          </w:p>
+        </w:tc>
+      </w:tr>
+      <w:tr>
+        <w:tc>
+          <w:tcPr>
+            <w:tcW w:type="dxa" w:w="2340"/>
+          </w:tcPr>
+          <w:p>
+            <w:r>
+              <w:t>11</w:t>
+            </w:r>
+          </w:p>
+        </w:tc>
+        <w:tc>
+          <w:tcPr>
+            <w:tcW w:type="dxa" w:w="2340"/>
+          </w:tcPr>
+          <w:p>
+            <w:r>
+              <w:t>4</w:t>
+            </w:r>
+          </w:p>
+        </w:tc>
+        <w:tc>
+          <w:tcPr>
+            <w:tcW w:type="dxa" w:w="2340"/>
+          </w:tcPr>
+          <w:p>
+            <w:r>
+              <w:t>0</w:t>
+            </w:r>
+          </w:p>
+        </w:tc>
+        <w:tc>
+          <w:tcPr>
+            <w:tcW w:type="dxa" w:w="2340"/>
+          </w:tcPr>
+          <w:p>
+            <w:r>
+              <w:t>0.0%</w:t>
+            </w:r>
+          </w:p>
+        </w:tc>
+      </w:tr>
+      <w:tr>
+        <w:tc>
+          <w:tcPr>
+            <w:tcW w:type="dxa" w:w="2340"/>
+          </w:tcPr>
+          <w:p>
+            <w:r>
+              <w:t>12</w:t>
+            </w:r>
+          </w:p>
+        </w:tc>
+        <w:tc>
+          <w:tcPr>
+            <w:tcW w:type="dxa" w:w="2340"/>
+          </w:tcPr>
+          <w:p>
+            <w:r>
+              <w:t>5</w:t>
+            </w:r>
+          </w:p>
+        </w:tc>
+        <w:tc>
+          <w:tcPr>
+            <w:tcW w:type="dxa" w:w="2340"/>
+          </w:tcPr>
+          <w:p>
+            <w:r>
+              <w:t>2</w:t>
+            </w:r>
+          </w:p>
+        </w:tc>
+        <w:tc>
+          <w:tcPr>
+            <w:tcW w:type="dxa" w:w="2340"/>
+          </w:tcPr>
+          <w:p>
+            <w:r>
+              <w:t>40.0%</w:t>
+            </w:r>
+          </w:p>
+        </w:tc>
+      </w:tr>
+      <w:tr>
+        <w:tc>
+          <w:tcPr>
+            <w:tcW w:type="dxa" w:w="2340"/>
+          </w:tcPr>
+          <w:p>
+            <w:r>
+              <w:t>13</w:t>
+            </w:r>
+          </w:p>
+        </w:tc>
+        <w:tc>
+          <w:tcPr>
+            <w:tcW w:type="dxa" w:w="2340"/>
+          </w:tcPr>
+          <w:p>
+            <w:r>
+              <w:t>22</w:t>
+            </w:r>
+          </w:p>
+        </w:tc>
+        <w:tc>
+          <w:tcPr>
+            <w:tcW w:type="dxa" w:w="2340"/>
+          </w:tcPr>
+          <w:p>
+            <w:r>
+              <w:t>0</w:t>
+            </w:r>
+          </w:p>
+        </w:tc>
+        <w:tc>
+          <w:tcPr>
+            <w:tcW w:type="dxa" w:w="2340"/>
+          </w:tcPr>
+          <w:p>
+            <w:r>
+              <w:t>0.0%</w:t>
+            </w:r>
+          </w:p>
+        </w:tc>
+      </w:tr>
+    </w:tbl>
+    <w:p>
+      <w:r>
+        <w:rPr>
+          <w:rFonts w:ascii="Calibri" w:hAnsi="Calibri"/>
+          <w:b w:val="0"/>
+          <w:i w:val="0"/>
+          <w:sz w:val="22"/>
+        </w:rPr>
+      </w:r>
+    </w:p>
+    <w:p>
+      <w:r>
+        <w:rPr>
+          <w:rFonts w:ascii="Calibri" w:hAnsi="Calibri"/>
+          <w:b w:val="0"/>
+          <w:i w:val="0"/>
+          <w:sz w:val="22"/>
+        </w:rPr>
+        <w:t>Classes 7 (3 samples), 8 (2 samples), 11 (4 samples), and 13 (22 samples) achieve 0% accuracy — the algorithm cannot learn these classes from such limited data. Class 12 (5 samples) manages 40% (2/5). In contrast, class 9 achieves a perfect 100% (9/9) despite having only 9 samples, indicating its ECG pattern is highly distinctive. Classes 3 (93.3%), 6 (88.0%), and 1 (88.6%) also show strong performance.</w:t>
+      </w:r>
+    </w:p>
+    <w:p>
+      <w:r>
+        <w:rPr>
+          <w:rFonts w:ascii="Calibri" w:hAnsi="Calibri"/>
+          <w:b w:val="0"/>
+          <w:i w:val="0"/>
+          <w:sz w:val="22"/>
+        </w:rPr>
+        <w:t>These results validate the class removal strategy used in the final algorithm: by removing unlearnable classes {7, 8, 11, 12, 13}, the model concentrates on the 8 classes it can meaningfully distinguish, achieving 86.8% 10-fold CV on the reduced set versus 78.3% LOOCV on the full set. The 85.0% binary accuracy without class removal confirms the algorithm's fundamental ability to separate healthy from diseased patients regardless of class granularity.</w:t>
       </w:r>
     </w:p>
     <w:p>
@@ -4233,7 +5082,7 @@
           <w:color w:val="1F2D5C"/>
           <w:sz w:val="32"/>
         </w:rPr>
-        <w:t>18. Conclusion</w:t>
+        <w:t>18. Synergy Pairing Analysis</w:t>
       </w:r>
     </w:p>
     <w:p>
@@ -4244,7 +5093,1487 @@
           <w:i w:val="0"/>
           <w:sz w:val="22"/>
         </w:rPr>
-        <w:t>This incremental study shows that a Bayesian arrhythmia classifier can be systematically improved from roughly 50% to over 86% peak 10-fold CV multiclass accuracy through a sequence of well-motivated, individually testable changes. The three most impactful individual changes, each measured against the common OVR baseline, were:</w:t>
+        <w:t>The individual change analysis reveals that many modifications degrade performance when applied in isolation. This section tests the hypothesis that certain changes only work in conjunction with others, by evaluating pairwise and small-group combinations.</w:t>
+      </w:r>
+    </w:p>
+    <w:p>
+      <w:pPr>
+        <w:pStyle w:val="Heading2"/>
+      </w:pPr>
+      <w:r>
+        <w:rPr>
+          <w:b/>
+          <w:color w:val="2E2E2E"/>
+          <w:sz w:val="26"/>
+        </w:rPr>
+        <w:t>18.1 Synergy Pairing Results</w:t>
+      </w:r>
+    </w:p>
+    <w:tbl>
+      <w:tblPr>
+        <w:tblStyle w:val="TableGrid"/>
+        <w:tblW w:type="auto" w:w="0"/>
+        <w:jc w:val="center"/>
+        <w:tblLook w:firstColumn="1" w:firstRow="1" w:lastColumn="0" w:lastRow="0" w:noHBand="0" w:noVBand="1" w:val="04A0"/>
+      </w:tblPr>
+      <w:tblGrid>
+        <w:gridCol w:w="1872"/>
+        <w:gridCol w:w="1872"/>
+        <w:gridCol w:w="1872"/>
+        <w:gridCol w:w="1872"/>
+        <w:gridCol w:w="1872"/>
+      </w:tblGrid>
+      <w:tr>
+        <w:tc>
+          <w:tcPr>
+            <w:tcW w:type="dxa" w:w="1872"/>
+            <w:shd w:fill="1F3864"/>
+          </w:tcPr>
+          <w:p>
+            <w:r>
+              <w:rPr>
+                <w:b/>
+                <w:color w:val="FFFFFF"/>
+              </w:rPr>
+              <w:t>Synergy Combination</w:t>
+            </w:r>
+          </w:p>
+        </w:tc>
+        <w:tc>
+          <w:tcPr>
+            <w:tcW w:type="dxa" w:w="1872"/>
+            <w:shd w:fill="1F3864"/>
+          </w:tcPr>
+          <w:p>
+            <w:r>
+              <w:rPr>
+                <w:b/>
+                <w:color w:val="FFFFFF"/>
+              </w:rPr>
+              <w:t>10-fold CV</w:t>
+            </w:r>
+          </w:p>
+        </w:tc>
+        <w:tc>
+          <w:tcPr>
+            <w:tcW w:type="dxa" w:w="1872"/>
+            <w:shd w:fill="1F3864"/>
+          </w:tcPr>
+          <w:p>
+            <w:r>
+              <w:rPr>
+                <w:b/>
+                <w:color w:val="FFFFFF"/>
+              </w:rPr>
+              <w:t>90/10 Multi</w:t>
+            </w:r>
+          </w:p>
+        </w:tc>
+        <w:tc>
+          <w:tcPr>
+            <w:tcW w:type="dxa" w:w="1872"/>
+            <w:shd w:fill="1F3864"/>
+          </w:tcPr>
+          <w:p>
+            <w:r>
+              <w:rPr>
+                <w:b/>
+                <w:color w:val="FFFFFF"/>
+              </w:rPr>
+              <w:t>90/10 Binary</w:t>
+            </w:r>
+          </w:p>
+        </w:tc>
+        <w:tc>
+          <w:tcPr>
+            <w:tcW w:type="dxa" w:w="1872"/>
+            <w:shd w:fill="1F3864"/>
+          </w:tcPr>
+          <w:p>
+            <w:r>
+              <w:rPr>
+                <w:b/>
+                <w:color w:val="FFFFFF"/>
+              </w:rPr>
+              <w:t>60/40 Multi</w:t>
+            </w:r>
+          </w:p>
+        </w:tc>
+      </w:tr>
+      <w:tr>
+        <w:tc>
+          <w:tcPr>
+            <w:tcW w:type="dxa" w:w="1872"/>
+          </w:tcPr>
+          <w:p>
+            <w:r>
+              <w:t>Dual AF + Feature Selection</w:t>
+            </w:r>
+          </w:p>
+        </w:tc>
+        <w:tc>
+          <w:tcPr>
+            <w:tcW w:type="dxa" w:w="1872"/>
+          </w:tcPr>
+          <w:p>
+            <w:r>
+              <w:t>64.6%</w:t>
+            </w:r>
+          </w:p>
+        </w:tc>
+        <w:tc>
+          <w:tcPr>
+            <w:tcW w:type="dxa" w:w="1872"/>
+          </w:tcPr>
+          <w:p>
+            <w:r>
+              <w:t>65.2%</w:t>
+            </w:r>
+          </w:p>
+        </w:tc>
+        <w:tc>
+          <w:tcPr>
+            <w:tcW w:type="dxa" w:w="1872"/>
+          </w:tcPr>
+          <w:p>
+            <w:r>
+              <w:t>78.3%</w:t>
+            </w:r>
+          </w:p>
+        </w:tc>
+        <w:tc>
+          <w:tcPr>
+            <w:tcW w:type="dxa" w:w="1872"/>
+          </w:tcPr>
+          <w:p>
+            <w:r>
+              <w:t>66.3%</w:t>
+            </w:r>
+          </w:p>
+        </w:tc>
+      </w:tr>
+      <w:tr>
+        <w:tc>
+          <w:tcPr>
+            <w:tcW w:type="dxa" w:w="1872"/>
+          </w:tcPr>
+          <w:p>
+            <w:r>
+              <w:t>Dual AF + Fisher</w:t>
+            </w:r>
+          </w:p>
+        </w:tc>
+        <w:tc>
+          <w:tcPr>
+            <w:tcW w:type="dxa" w:w="1872"/>
+          </w:tcPr>
+          <w:p>
+            <w:r>
+              <w:t>67.0%</w:t>
+            </w:r>
+          </w:p>
+        </w:tc>
+        <w:tc>
+          <w:tcPr>
+            <w:tcW w:type="dxa" w:w="1872"/>
+          </w:tcPr>
+          <w:p>
+            <w:r>
+              <w:t>69.6%</w:t>
+            </w:r>
+          </w:p>
+        </w:tc>
+        <w:tc>
+          <w:tcPr>
+            <w:tcW w:type="dxa" w:w="1872"/>
+          </w:tcPr>
+          <w:p>
+            <w:r>
+              <w:t>82.6%</w:t>
+            </w:r>
+          </w:p>
+        </w:tc>
+        <w:tc>
+          <w:tcPr>
+            <w:tcW w:type="dxa" w:w="1872"/>
+          </w:tcPr>
+          <w:p>
+            <w:r>
+              <w:t>71.3%</w:t>
+            </w:r>
+          </w:p>
+        </w:tc>
+      </w:tr>
+      <w:tr>
+        <w:tc>
+          <w:tcPr>
+            <w:tcW w:type="dxa" w:w="1872"/>
+          </w:tcPr>
+          <w:p>
+            <w:r>
+              <w:t>Dual AF + Ratio Scoring</w:t>
+            </w:r>
+          </w:p>
+        </w:tc>
+        <w:tc>
+          <w:tcPr>
+            <w:tcW w:type="dxa" w:w="1872"/>
+          </w:tcPr>
+          <w:p>
+            <w:r>
+              <w:t>48.5%</w:t>
+            </w:r>
+          </w:p>
+        </w:tc>
+        <w:tc>
+          <w:tcPr>
+            <w:tcW w:type="dxa" w:w="1872"/>
+          </w:tcPr>
+          <w:p>
+            <w:r>
+              <w:t>56.5%</w:t>
+            </w:r>
+          </w:p>
+        </w:tc>
+        <w:tc>
+          <w:tcPr>
+            <w:tcW w:type="dxa" w:w="1872"/>
+          </w:tcPr>
+          <w:p>
+            <w:r>
+              <w:t>71.7%</w:t>
+            </w:r>
+          </w:p>
+        </w:tc>
+        <w:tc>
+          <w:tcPr>
+            <w:tcW w:type="dxa" w:w="1872"/>
+          </w:tcPr>
+          <w:p>
+            <w:r>
+              <w:t>51.9%</w:t>
+            </w:r>
+          </w:p>
+        </w:tc>
+      </w:tr>
+      <w:tr>
+        <w:tc>
+          <w:tcPr>
+            <w:tcW w:type="dxa" w:w="1872"/>
+          </w:tcPr>
+          <w:p>
+            <w:r>
+              <w:t>Feature Sel + Dual AF + Fisher</w:t>
+            </w:r>
+          </w:p>
+        </w:tc>
+        <w:tc>
+          <w:tcPr>
+            <w:tcW w:type="dxa" w:w="1872"/>
+          </w:tcPr>
+          <w:p>
+            <w:r>
+              <w:t>64.4%</w:t>
+            </w:r>
+          </w:p>
+        </w:tc>
+        <w:tc>
+          <w:tcPr>
+            <w:tcW w:type="dxa" w:w="1872"/>
+          </w:tcPr>
+          <w:p>
+            <w:r>
+              <w:t>67.4%</w:t>
+            </w:r>
+          </w:p>
+        </w:tc>
+        <w:tc>
+          <w:tcPr>
+            <w:tcW w:type="dxa" w:w="1872"/>
+          </w:tcPr>
+          <w:p>
+            <w:r>
+              <w:t>80.4%</w:t>
+            </w:r>
+          </w:p>
+        </w:tc>
+        <w:tc>
+          <w:tcPr>
+            <w:tcW w:type="dxa" w:w="1872"/>
+          </w:tcPr>
+          <w:p>
+            <w:r>
+              <w:t>66.9%</w:t>
+            </w:r>
+          </w:p>
+        </w:tc>
+      </w:tr>
+      <w:tr>
+        <w:tc>
+          <w:tcPr>
+            <w:tcW w:type="dxa" w:w="1872"/>
+          </w:tcPr>
+          <w:p>
+            <w:r>
+              <w:t>Class Removal + Rare Params</w:t>
+            </w:r>
+          </w:p>
+        </w:tc>
+        <w:tc>
+          <w:tcPr>
+            <w:tcW w:type="dxa" w:w="1872"/>
+          </w:tcPr>
+          <w:p>
+            <w:r>
+              <w:t>25.0%</w:t>
+            </w:r>
+          </w:p>
+        </w:tc>
+        <w:tc>
+          <w:tcPr>
+            <w:tcW w:type="dxa" w:w="1872"/>
+          </w:tcPr>
+          <w:p>
+            <w:r>
+              <w:t>42.9%</w:t>
+            </w:r>
+          </w:p>
+        </w:tc>
+        <w:tc>
+          <w:tcPr>
+            <w:tcW w:type="dxa" w:w="1872"/>
+          </w:tcPr>
+          <w:p>
+            <w:r>
+              <w:t>59.5%</w:t>
+            </w:r>
+          </w:p>
+        </w:tc>
+        <w:tc>
+          <w:tcPr>
+            <w:tcW w:type="dxa" w:w="1872"/>
+          </w:tcPr>
+          <w:p>
+            <w:r>
+              <w:t>32.9%</w:t>
+            </w:r>
+          </w:p>
+        </w:tc>
+      </w:tr>
+      <w:tr>
+        <w:tc>
+          <w:tcPr>
+            <w:tcW w:type="dxa" w:w="1872"/>
+          </w:tcPr>
+          <w:p>
+            <w:r>
+              <w:t>Dual AF + Ratio + Healthy Bar</w:t>
+            </w:r>
+          </w:p>
+        </w:tc>
+        <w:tc>
+          <w:tcPr>
+            <w:tcW w:type="dxa" w:w="1872"/>
+          </w:tcPr>
+          <w:p>
+            <w:r>
+              <w:t>68.4%</w:t>
+            </w:r>
+          </w:p>
+        </w:tc>
+        <w:tc>
+          <w:tcPr>
+            <w:tcW w:type="dxa" w:w="1872"/>
+          </w:tcPr>
+          <w:p>
+            <w:r>
+              <w:t>76.1%</w:t>
+            </w:r>
+          </w:p>
+        </w:tc>
+        <w:tc>
+          <w:tcPr>
+            <w:tcW w:type="dxa" w:w="1872"/>
+          </w:tcPr>
+          <w:p>
+            <w:r>
+              <w:t>84.8%</w:t>
+            </w:r>
+          </w:p>
+        </w:tc>
+        <w:tc>
+          <w:tcPr>
+            <w:tcW w:type="dxa" w:w="1872"/>
+          </w:tcPr>
+          <w:p>
+            <w:r>
+              <w:t>68.5%</w:t>
+            </w:r>
+          </w:p>
+        </w:tc>
+      </w:tr>
+    </w:tbl>
+    <w:p>
+      <w:r>
+        <w:rPr>
+          <w:rFonts w:ascii="Calibri" w:hAnsi="Calibri"/>
+          <w:b w:val="0"/>
+          <w:i w:val="0"/>
+          <w:sz w:val="22"/>
+        </w:rPr>
+      </w:r>
+    </w:p>
+    <w:p>
+      <w:pPr>
+        <w:pStyle w:val="Heading2"/>
+      </w:pPr>
+      <w:r>
+        <w:rPr>
+          <w:b/>
+          <w:color w:val="2E2E2E"/>
+          <w:sz w:val="26"/>
+        </w:rPr>
+        <w:t>18.2 Synergy Analysis</w:t>
+      </w:r>
+    </w:p>
+    <w:p>
+      <w:r>
+        <w:rPr>
+          <w:rFonts w:ascii="Calibri" w:hAnsi="Calibri"/>
+          <w:b w:val="0"/>
+          <w:i w:val="0"/>
+          <w:sz w:val="22"/>
+        </w:rPr>
+        <w:t>Dual AF + Fisher Weighting (S03) is the strongest pairwise synergy, achieving 67.0% 10-fold CV compared to 62.6% for Dual AF alone and 63.3% for Fisher alone. Fisher weighting amplifies features that best discriminate between classes, and this is more effective when the evidence system can track both supporting and opposing evidence through dual AF. The combined effect (+4.4% over dual AF) exceeds the individual Fisher gain (+3.1% over OVR baseline), confirming true synergy.</w:t>
+      </w:r>
+    </w:p>
+    <w:p>
+      <w:r>
+        <w:rPr>
+          <w:rFonts w:ascii="Calibri" w:hAnsi="Calibri"/>
+          <w:b w:val="0"/>
+          <w:i w:val="0"/>
+          <w:sz w:val="22"/>
+        </w:rPr>
+        <w:t>The full scoring pipeline (S09: Dual AF + Ratio + Healthy Bar) achieves 68.4%, outperforming healthy bar alone (67.0%) but critically demonstrating that ratio scoring requires both dual AF (for the for/against ratio) and healthy bar (for adaptive thresholds) to function. Ratio scoring alone degrades performance to 48.5%, but within its full pipeline it contributes positively.</w:t>
+      </w:r>
+    </w:p>
+    <w:p>
+      <w:r>
+        <w:rPr>
+          <w:rFonts w:ascii="Calibri" w:hAnsi="Calibri"/>
+          <w:b w:val="0"/>
+          <w:i w:val="0"/>
+          <w:sz w:val="22"/>
+        </w:rPr>
+        <w:t>Class Removal + Rare Class Parameters (S08) at 25.0% shows that these two changes are insufficient on their own — they address class distribution problems but need the underlying evidence quality improvements (dual AF, Fisher, scoring pipeline) to be effective. In the final system, class removal contributes +5.7% when added to a well-functioning evidence and scoring system.</w:t>
+      </w:r>
+    </w:p>
+    <w:p>
+      <w:pPr>
+        <w:jc w:val="center"/>
+      </w:pPr>
+      <w:r>
+        <w:drawing>
+          <wp:inline xmlns:a="http://schemas.openxmlformats.org/drawingml/2006/main" xmlns:pic="http://schemas.openxmlformats.org/drawingml/2006/picture">
+            <wp:extent cx="5486400" cy="3038622"/>
+            <wp:docPr id="9" name="Picture 9"/>
+            <wp:cNvGraphicFramePr>
+              <a:graphicFrameLocks noChangeAspect="1"/>
+            </wp:cNvGraphicFramePr>
+            <a:graphic>
+              <a:graphicData uri="http://schemas.openxmlformats.org/drawingml/2006/picture">
+                <pic:pic>
+                  <pic:nvPicPr>
+                    <pic:cNvPr id="0" name="cds_chart_vni9jjis.png"/>
+                    <pic:cNvPicPr/>
+                  </pic:nvPicPr>
+                  <pic:blipFill>
+                    <a:blip r:embed="rId17"/>
+                    <a:stretch>
+                      <a:fillRect/>
+                    </a:stretch>
+                  </pic:blipFill>
+                  <pic:spPr>
+                    <a:xfrm>
+                      <a:off x="0" y="0"/>
+                      <a:ext cx="5486400" cy="3038622"/>
+                    </a:xfrm>
+                    <a:prstGeom prst="rect"/>
+                  </pic:spPr>
+                </pic:pic>
+              </a:graphicData>
+            </a:graphic>
+          </wp:inline>
+        </w:drawing>
+      </w:r>
+    </w:p>
+    <w:p>
+      <w:pPr>
+        <w:pStyle w:val="Heading1"/>
+      </w:pPr>
+      <w:r>
+        <w:rPr>
+          <w:b/>
+          <w:color w:val="1F2D5C"/>
+          <w:sz w:val="32"/>
+        </w:rPr>
+        <w:t>19. Progressive Build-Up Analysis</w:t>
+      </w:r>
+    </w:p>
+    <w:p>
+      <w:r>
+        <w:rPr>
+          <w:rFonts w:ascii="Calibri" w:hAnsi="Calibri"/>
+          <w:b w:val="0"/>
+          <w:i w:val="0"/>
+          <w:sz w:val="22"/>
+        </w:rPr>
+        <w:t>The most revealing analysis is the progressive build-up: starting from the OVR baseline, each change is layered on top of the previous ones in a carefully chosen order. This shows exactly how each change contributes in the context of all previous changes, revealing the true incremental value of each modification.</w:t>
+      </w:r>
+    </w:p>
+    <w:p>
+      <w:pPr>
+        <w:pStyle w:val="Heading2"/>
+      </w:pPr>
+      <w:r>
+        <w:rPr>
+          <w:b/>
+          <w:color w:val="2E2E2E"/>
+          <w:sz w:val="26"/>
+        </w:rPr>
+        <w:t>19.1 Progressive Build-Up Results</w:t>
+      </w:r>
+    </w:p>
+    <w:tbl>
+      <w:tblPr>
+        <w:tblStyle w:val="TableGrid"/>
+        <w:tblW w:type="auto" w:w="0"/>
+        <w:jc w:val="center"/>
+        <w:tblLook w:firstColumn="1" w:firstRow="1" w:lastColumn="0" w:lastRow="0" w:noHBand="0" w:noVBand="1" w:val="04A0"/>
+      </w:tblPr>
+      <w:tblGrid>
+        <w:gridCol w:w="1560"/>
+        <w:gridCol w:w="1560"/>
+        <w:gridCol w:w="1560"/>
+        <w:gridCol w:w="1560"/>
+        <w:gridCol w:w="1560"/>
+        <w:gridCol w:w="1560"/>
+      </w:tblGrid>
+      <w:tr>
+        <w:tc>
+          <w:tcPr>
+            <w:tcW w:type="dxa" w:w="1560"/>
+            <w:shd w:fill="1F3864"/>
+          </w:tcPr>
+          <w:p>
+            <w:r>
+              <w:rPr>
+                <w:b/>
+                <w:color w:val="FFFFFF"/>
+              </w:rPr>
+              <w:t>Stage</w:t>
+            </w:r>
+          </w:p>
+        </w:tc>
+        <w:tc>
+          <w:tcPr>
+            <w:tcW w:type="dxa" w:w="1560"/>
+            <w:shd w:fill="1F3864"/>
+          </w:tcPr>
+          <w:p>
+            <w:r>
+              <w:rPr>
+                <w:b/>
+                <w:color w:val="FFFFFF"/>
+              </w:rPr>
+              <w:t>10-fold CV</w:t>
+            </w:r>
+          </w:p>
+        </w:tc>
+        <w:tc>
+          <w:tcPr>
+            <w:tcW w:type="dxa" w:w="1560"/>
+            <w:shd w:fill="1F3864"/>
+          </w:tcPr>
+          <w:p>
+            <w:r>
+              <w:rPr>
+                <w:b/>
+                <w:color w:val="FFFFFF"/>
+              </w:rPr>
+              <w:t>Delta</w:t>
+            </w:r>
+          </w:p>
+        </w:tc>
+        <w:tc>
+          <w:tcPr>
+            <w:tcW w:type="dxa" w:w="1560"/>
+            <w:shd w:fill="1F3864"/>
+          </w:tcPr>
+          <w:p>
+            <w:r>
+              <w:rPr>
+                <w:b/>
+                <w:color w:val="FFFFFF"/>
+              </w:rPr>
+              <w:t>90/10 Multi</w:t>
+            </w:r>
+          </w:p>
+        </w:tc>
+        <w:tc>
+          <w:tcPr>
+            <w:tcW w:type="dxa" w:w="1560"/>
+            <w:shd w:fill="1F3864"/>
+          </w:tcPr>
+          <w:p>
+            <w:r>
+              <w:rPr>
+                <w:b/>
+                <w:color w:val="FFFFFF"/>
+              </w:rPr>
+              <w:t>90/10 Binary</w:t>
+            </w:r>
+          </w:p>
+        </w:tc>
+        <w:tc>
+          <w:tcPr>
+            <w:tcW w:type="dxa" w:w="1560"/>
+            <w:shd w:fill="1F3864"/>
+          </w:tcPr>
+          <w:p>
+            <w:r>
+              <w:rPr>
+                <w:b/>
+                <w:color w:val="FFFFFF"/>
+              </w:rPr>
+              <w:t>60/40 Multi</w:t>
+            </w:r>
+          </w:p>
+        </w:tc>
+      </w:tr>
+      <w:tr>
+        <w:tc>
+          <w:tcPr>
+            <w:tcW w:type="dxa" w:w="1560"/>
+          </w:tcPr>
+          <w:p>
+            <w:r>
+              <w:t>OVR Baseline</w:t>
+            </w:r>
+          </w:p>
+        </w:tc>
+        <w:tc>
+          <w:tcPr>
+            <w:tcW w:type="dxa" w:w="1560"/>
+          </w:tcPr>
+          <w:p>
+            <w:r>
+              <w:t>28.5%</w:t>
+            </w:r>
+          </w:p>
+        </w:tc>
+        <w:tc>
+          <w:tcPr>
+            <w:tcW w:type="dxa" w:w="1560"/>
+          </w:tcPr>
+          <w:p>
+            <w:r>
+              <w:t>—</w:t>
+            </w:r>
+          </w:p>
+        </w:tc>
+        <w:tc>
+          <w:tcPr>
+            <w:tcW w:type="dxa" w:w="1560"/>
+          </w:tcPr>
+          <w:p>
+            <w:r>
+              <w:t>41.3%</w:t>
+            </w:r>
+          </w:p>
+        </w:tc>
+        <w:tc>
+          <w:tcPr>
+            <w:tcW w:type="dxa" w:w="1560"/>
+          </w:tcPr>
+          <w:p>
+            <w:r>
+              <w:t>54.3%</w:t>
+            </w:r>
+          </w:p>
+        </w:tc>
+        <w:tc>
+          <w:tcPr>
+            <w:tcW w:type="dxa" w:w="1560"/>
+          </w:tcPr>
+          <w:p>
+            <w:r>
+              <w:t>33.7%</w:t>
+            </w:r>
+          </w:p>
+        </w:tc>
+      </w:tr>
+      <w:tr>
+        <w:tc>
+          <w:tcPr>
+            <w:tcW w:type="dxa" w:w="1560"/>
+          </w:tcPr>
+          <w:p>
+            <w:r>
+              <w:t>+ Dual AF</w:t>
+            </w:r>
+          </w:p>
+        </w:tc>
+        <w:tc>
+          <w:tcPr>
+            <w:tcW w:type="dxa" w:w="1560"/>
+          </w:tcPr>
+          <w:p>
+            <w:r>
+              <w:t>62.6%</w:t>
+            </w:r>
+          </w:p>
+        </w:tc>
+        <w:tc>
+          <w:tcPr>
+            <w:tcW w:type="dxa" w:w="1560"/>
+          </w:tcPr>
+          <w:p>
+            <w:r>
+              <w:t>+34.1%</w:t>
+            </w:r>
+          </w:p>
+        </w:tc>
+        <w:tc>
+          <w:tcPr>
+            <w:tcW w:type="dxa" w:w="1560"/>
+          </w:tcPr>
+          <w:p>
+            <w:r>
+              <w:t>69.6%</w:t>
+            </w:r>
+          </w:p>
+        </w:tc>
+        <w:tc>
+          <w:tcPr>
+            <w:tcW w:type="dxa" w:w="1560"/>
+          </w:tcPr>
+          <w:p>
+            <w:r>
+              <w:t>78.3%</w:t>
+            </w:r>
+          </w:p>
+        </w:tc>
+        <w:tc>
+          <w:tcPr>
+            <w:tcW w:type="dxa" w:w="1560"/>
+          </w:tcPr>
+          <w:p>
+            <w:r>
+              <w:t>69.6%</w:t>
+            </w:r>
+          </w:p>
+        </w:tc>
+      </w:tr>
+      <w:tr>
+        <w:tc>
+          <w:tcPr>
+            <w:tcW w:type="dxa" w:w="1560"/>
+          </w:tcPr>
+          <w:p>
+            <w:r>
+              <w:t>+ Fisher Weighting</w:t>
+            </w:r>
+          </w:p>
+        </w:tc>
+        <w:tc>
+          <w:tcPr>
+            <w:tcW w:type="dxa" w:w="1560"/>
+          </w:tcPr>
+          <w:p>
+            <w:r>
+              <w:t>67.0%</w:t>
+            </w:r>
+          </w:p>
+        </w:tc>
+        <w:tc>
+          <w:tcPr>
+            <w:tcW w:type="dxa" w:w="1560"/>
+          </w:tcPr>
+          <w:p>
+            <w:r>
+              <w:t>+4.4%</w:t>
+            </w:r>
+          </w:p>
+        </w:tc>
+        <w:tc>
+          <w:tcPr>
+            <w:tcW w:type="dxa" w:w="1560"/>
+          </w:tcPr>
+          <w:p>
+            <w:r>
+              <w:t>69.6%</w:t>
+            </w:r>
+          </w:p>
+        </w:tc>
+        <w:tc>
+          <w:tcPr>
+            <w:tcW w:type="dxa" w:w="1560"/>
+          </w:tcPr>
+          <w:p>
+            <w:r>
+              <w:t>82.6%</w:t>
+            </w:r>
+          </w:p>
+        </w:tc>
+        <w:tc>
+          <w:tcPr>
+            <w:tcW w:type="dxa" w:w="1560"/>
+          </w:tcPr>
+          <w:p>
+            <w:r>
+              <w:t>71.3%</w:t>
+            </w:r>
+          </w:p>
+        </w:tc>
+      </w:tr>
+      <w:tr>
+        <w:tc>
+          <w:tcPr>
+            <w:tcW w:type="dxa" w:w="1560"/>
+          </w:tcPr>
+          <w:p>
+            <w:r>
+              <w:t>+ Healthy Bar</w:t>
+            </w:r>
+          </w:p>
+        </w:tc>
+        <w:tc>
+          <w:tcPr>
+            <w:tcW w:type="dxa" w:w="1560"/>
+          </w:tcPr>
+          <w:p>
+            <w:r>
+              <w:t>54.2%</w:t>
+            </w:r>
+          </w:p>
+        </w:tc>
+        <w:tc>
+          <w:tcPr>
+            <w:tcW w:type="dxa" w:w="1560"/>
+          </w:tcPr>
+          <w:p>
+            <w:r>
+              <w:t>-12.8%</w:t>
+            </w:r>
+          </w:p>
+        </w:tc>
+        <w:tc>
+          <w:tcPr>
+            <w:tcW w:type="dxa" w:w="1560"/>
+          </w:tcPr>
+          <w:p>
+            <w:r>
+              <w:t>76.1%</w:t>
+            </w:r>
+          </w:p>
+        </w:tc>
+        <w:tc>
+          <w:tcPr>
+            <w:tcW w:type="dxa" w:w="1560"/>
+          </w:tcPr>
+          <w:p>
+            <w:r>
+              <w:t>76.1%</w:t>
+            </w:r>
+          </w:p>
+        </w:tc>
+        <w:tc>
+          <w:tcPr>
+            <w:tcW w:type="dxa" w:w="1560"/>
+          </w:tcPr>
+          <w:p>
+            <w:r>
+              <w:t>60.2%</w:t>
+            </w:r>
+          </w:p>
+        </w:tc>
+      </w:tr>
+      <w:tr>
+        <w:tc>
+          <w:tcPr>
+            <w:tcW w:type="dxa" w:w="1560"/>
+          </w:tcPr>
+          <w:p>
+            <w:r>
+              <w:t>+ Ratio Scoring</w:t>
+            </w:r>
+          </w:p>
+        </w:tc>
+        <w:tc>
+          <w:tcPr>
+            <w:tcW w:type="dxa" w:w="1560"/>
+          </w:tcPr>
+          <w:p>
+            <w:r>
+              <w:t>73.9%</w:t>
+            </w:r>
+          </w:p>
+        </w:tc>
+        <w:tc>
+          <w:tcPr>
+            <w:tcW w:type="dxa" w:w="1560"/>
+          </w:tcPr>
+          <w:p>
+            <w:r>
+              <w:t>+19.7%</w:t>
+            </w:r>
+          </w:p>
+        </w:tc>
+        <w:tc>
+          <w:tcPr>
+            <w:tcW w:type="dxa" w:w="1560"/>
+          </w:tcPr>
+          <w:p>
+            <w:r>
+              <w:t>78.3%</w:t>
+            </w:r>
+          </w:p>
+        </w:tc>
+        <w:tc>
+          <w:tcPr>
+            <w:tcW w:type="dxa" w:w="1560"/>
+          </w:tcPr>
+          <w:p>
+            <w:r>
+              <w:t>87.0%</w:t>
+            </w:r>
+          </w:p>
+        </w:tc>
+        <w:tc>
+          <w:tcPr>
+            <w:tcW w:type="dxa" w:w="1560"/>
+          </w:tcPr>
+          <w:p>
+            <w:r>
+              <w:t>77.9%</w:t>
+            </w:r>
+          </w:p>
+        </w:tc>
+      </w:tr>
+      <w:tr>
+        <w:tc>
+          <w:tcPr>
+            <w:tcW w:type="dxa" w:w="1560"/>
+          </w:tcPr>
+          <w:p>
+            <w:r>
+              <w:t>+ Feature Selection</w:t>
+            </w:r>
+          </w:p>
+        </w:tc>
+        <w:tc>
+          <w:tcPr>
+            <w:tcW w:type="dxa" w:w="1560"/>
+          </w:tcPr>
+          <w:p>
+            <w:r>
+              <w:t>74.8%</w:t>
+            </w:r>
+          </w:p>
+        </w:tc>
+        <w:tc>
+          <w:tcPr>
+            <w:tcW w:type="dxa" w:w="1560"/>
+          </w:tcPr>
+          <w:p>
+            <w:r>
+              <w:t>+0.9%</w:t>
+            </w:r>
+          </w:p>
+        </w:tc>
+        <w:tc>
+          <w:tcPr>
+            <w:tcW w:type="dxa" w:w="1560"/>
+          </w:tcPr>
+          <w:p>
+            <w:r>
+              <w:t>78.3%</w:t>
+            </w:r>
+          </w:p>
+        </w:tc>
+        <w:tc>
+          <w:tcPr>
+            <w:tcW w:type="dxa" w:w="1560"/>
+          </w:tcPr>
+          <w:p>
+            <w:r>
+              <w:t>89.1%</w:t>
+            </w:r>
+          </w:p>
+        </w:tc>
+        <w:tc>
+          <w:tcPr>
+            <w:tcW w:type="dxa" w:w="1560"/>
+          </w:tcPr>
+          <w:p>
+            <w:r>
+              <w:t>78.5%</w:t>
+            </w:r>
+          </w:p>
+        </w:tc>
+      </w:tr>
+      <w:tr>
+        <w:tc>
+          <w:tcPr>
+            <w:tcW w:type="dxa" w:w="1560"/>
+          </w:tcPr>
+          <w:p>
+            <w:r>
+              <w:t>+ Class Removal</w:t>
+            </w:r>
+          </w:p>
+        </w:tc>
+        <w:tc>
+          <w:tcPr>
+            <w:tcW w:type="dxa" w:w="1560"/>
+          </w:tcPr>
+          <w:p>
+            <w:r>
+              <w:t>80.5%</w:t>
+            </w:r>
+          </w:p>
+        </w:tc>
+        <w:tc>
+          <w:tcPr>
+            <w:tcW w:type="dxa" w:w="1560"/>
+          </w:tcPr>
+          <w:p>
+            <w:r>
+              <w:t>+5.7%</w:t>
+            </w:r>
+          </w:p>
+        </w:tc>
+        <w:tc>
+          <w:tcPr>
+            <w:tcW w:type="dxa" w:w="1560"/>
+          </w:tcPr>
+          <w:p>
+            <w:r>
+              <w:t>83.3%</w:t>
+            </w:r>
+          </w:p>
+        </w:tc>
+        <w:tc>
+          <w:tcPr>
+            <w:tcW w:type="dxa" w:w="1560"/>
+          </w:tcPr>
+          <w:p>
+            <w:r>
+              <w:t>90.5%</w:t>
+            </w:r>
+          </w:p>
+        </w:tc>
+        <w:tc>
+          <w:tcPr>
+            <w:tcW w:type="dxa" w:w="1560"/>
+          </w:tcPr>
+          <w:p>
+            <w:r>
+              <w:t>81.4%</w:t>
+            </w:r>
+          </w:p>
+        </w:tc>
+      </w:tr>
+      <w:tr>
+        <w:tc>
+          <w:tcPr>
+            <w:tcW w:type="dxa" w:w="1560"/>
+          </w:tcPr>
+          <w:p>
+            <w:r>
+              <w:t>+ Rare Class Params</w:t>
+            </w:r>
+          </w:p>
+        </w:tc>
+        <w:tc>
+          <w:tcPr>
+            <w:tcW w:type="dxa" w:w="1560"/>
+          </w:tcPr>
+          <w:p>
+            <w:r>
+              <w:t>79.1%</w:t>
+            </w:r>
+          </w:p>
+        </w:tc>
+        <w:tc>
+          <w:tcPr>
+            <w:tcW w:type="dxa" w:w="1560"/>
+          </w:tcPr>
+          <w:p>
+            <w:r>
+              <w:t>-1.4%</w:t>
+            </w:r>
+          </w:p>
+        </w:tc>
+        <w:tc>
+          <w:tcPr>
+            <w:tcW w:type="dxa" w:w="1560"/>
+          </w:tcPr>
+          <w:p>
+            <w:r>
+              <w:t>83.3%</w:t>
+            </w:r>
+          </w:p>
+        </w:tc>
+        <w:tc>
+          <w:tcPr>
+            <w:tcW w:type="dxa" w:w="1560"/>
+          </w:tcPr>
+          <w:p>
+            <w:r>
+              <w:t>92.9%</w:t>
+            </w:r>
+          </w:p>
+        </w:tc>
+        <w:tc>
+          <w:tcPr>
+            <w:tcW w:type="dxa" w:w="1560"/>
+          </w:tcPr>
+          <w:p>
+            <w:r>
+              <w:t>80.8%</w:t>
+            </w:r>
+          </w:p>
+        </w:tc>
+      </w:tr>
+      <w:tr>
+        <w:tc>
+          <w:tcPr>
+            <w:tcW w:type="dxa" w:w="1560"/>
+          </w:tcPr>
+          <w:p>
+            <w:r>
+              <w:t>+ Class Thresholds</w:t>
+            </w:r>
+          </w:p>
+        </w:tc>
+        <w:tc>
+          <w:tcPr>
+            <w:tcW w:type="dxa" w:w="1560"/>
+          </w:tcPr>
+          <w:p>
+            <w:r>
+              <w:t>82.0%</w:t>
+            </w:r>
+          </w:p>
+        </w:tc>
+        <w:tc>
+          <w:tcPr>
+            <w:tcW w:type="dxa" w:w="1560"/>
+          </w:tcPr>
+          <w:p>
+            <w:r>
+              <w:t>+2.9%</w:t>
+            </w:r>
+          </w:p>
+        </w:tc>
+        <w:tc>
+          <w:tcPr>
+            <w:tcW w:type="dxa" w:w="1560"/>
+          </w:tcPr>
+          <w:p>
+            <w:r>
+              <w:t>85.7%</w:t>
+            </w:r>
+          </w:p>
+        </w:tc>
+        <w:tc>
+          <w:tcPr>
+            <w:tcW w:type="dxa" w:w="1560"/>
+          </w:tcPr>
+          <w:p>
+            <w:r>
+              <w:t>95.2%</w:t>
+            </w:r>
+          </w:p>
+        </w:tc>
+        <w:tc>
+          <w:tcPr>
+            <w:tcW w:type="dxa" w:w="1560"/>
+          </w:tcPr>
+          <w:p>
+            <w:r>
+              <w:t>81.4%</w:t>
+            </w:r>
+          </w:p>
+        </w:tc>
+      </w:tr>
+      <w:tr>
+        <w:tc>
+          <w:tcPr>
+            <w:tcW w:type="dxa" w:w="1560"/>
+          </w:tcPr>
+          <w:p>
+            <w:r>
+              <w:t>+ Supervised Binning</w:t>
+            </w:r>
+          </w:p>
+        </w:tc>
+        <w:tc>
+          <w:tcPr>
+            <w:tcW w:type="dxa" w:w="1560"/>
+          </w:tcPr>
+          <w:p>
+            <w:r>
+              <w:t>86.1%</w:t>
+            </w:r>
+          </w:p>
+        </w:tc>
+        <w:tc>
+          <w:tcPr>
+            <w:tcW w:type="dxa" w:w="1560"/>
+          </w:tcPr>
+          <w:p>
+            <w:r>
+              <w:t>+4.1%</w:t>
+            </w:r>
+          </w:p>
+        </w:tc>
+        <w:tc>
+          <w:tcPr>
+            <w:tcW w:type="dxa" w:w="1560"/>
+          </w:tcPr>
+          <w:p>
+            <w:r>
+              <w:t>92.9%</w:t>
+            </w:r>
+          </w:p>
+        </w:tc>
+        <w:tc>
+          <w:tcPr>
+            <w:tcW w:type="dxa" w:w="1560"/>
+          </w:tcPr>
+          <w:p>
+            <w:r>
+              <w:t>95.2%</w:t>
+            </w:r>
+          </w:p>
+        </w:tc>
+        <w:tc>
+          <w:tcPr>
+            <w:tcW w:type="dxa" w:w="1560"/>
+          </w:tcPr>
+          <w:p>
+            <w:r>
+              <w:t>85.6%</w:t>
+            </w:r>
+          </w:p>
+        </w:tc>
+      </w:tr>
+      <w:tr>
+        <w:tc>
+          <w:tcPr>
+            <w:tcW w:type="dxa" w:w="1560"/>
+          </w:tcPr>
+          <w:p>
+            <w:r>
+              <w:t>+ Laplace (Final)</w:t>
+            </w:r>
+          </w:p>
+        </w:tc>
+        <w:tc>
+          <w:tcPr>
+            <w:tcW w:type="dxa" w:w="1560"/>
+          </w:tcPr>
+          <w:p>
+            <w:r>
+              <w:t>86.8%</w:t>
+            </w:r>
+          </w:p>
+        </w:tc>
+        <w:tc>
+          <w:tcPr>
+            <w:tcW w:type="dxa" w:w="1560"/>
+          </w:tcPr>
+          <w:p>
+            <w:r>
+              <w:t>+0.7%</w:t>
+            </w:r>
+          </w:p>
+        </w:tc>
+        <w:tc>
+          <w:tcPr>
+            <w:tcW w:type="dxa" w:w="1560"/>
+          </w:tcPr>
+          <w:p>
+            <w:r>
+              <w:t>92.9%</w:t>
+            </w:r>
+          </w:p>
+        </w:tc>
+        <w:tc>
+          <w:tcPr>
+            <w:tcW w:type="dxa" w:w="1560"/>
+          </w:tcPr>
+          <w:p>
+            <w:r>
+              <w:t>97.6%</w:t>
+            </w:r>
+          </w:p>
+        </w:tc>
+        <w:tc>
+          <w:tcPr>
+            <w:tcW w:type="dxa" w:w="1560"/>
+          </w:tcPr>
+          <w:p>
+            <w:r>
+              <w:t>86.2%</w:t>
+            </w:r>
+          </w:p>
+        </w:tc>
+      </w:tr>
+    </w:tbl>
+    <w:p>
+      <w:pPr>
+        <w:jc w:val="center"/>
+      </w:pPr>
+      <w:r>
+        <w:drawing>
+          <wp:inline xmlns:a="http://schemas.openxmlformats.org/drawingml/2006/main" xmlns:pic="http://schemas.openxmlformats.org/drawingml/2006/picture">
+            <wp:extent cx="5486400" cy="3545058"/>
+            <wp:docPr id="10" name="Picture 10"/>
+            <wp:cNvGraphicFramePr>
+              <a:graphicFrameLocks noChangeAspect="1"/>
+            </wp:cNvGraphicFramePr>
+            <a:graphic>
+              <a:graphicData uri="http://schemas.openxmlformats.org/drawingml/2006/picture">
+                <pic:pic>
+                  <pic:nvPicPr>
+                    <pic:cNvPr id="0" name="cds_chart_j7z67_2e.png"/>
+                    <pic:cNvPicPr/>
+                  </pic:nvPicPr>
+                  <pic:blipFill>
+                    <a:blip r:embed="rId18"/>
+                    <a:stretch>
+                      <a:fillRect/>
+                    </a:stretch>
+                  </pic:blipFill>
+                  <pic:spPr>
+                    <a:xfrm>
+                      <a:off x="0" y="0"/>
+                      <a:ext cx="5486400" cy="3545058"/>
+                    </a:xfrm>
+                    <a:prstGeom prst="rect"/>
+                  </pic:spPr>
+                </pic:pic>
+              </a:graphicData>
+            </a:graphic>
+          </wp:inline>
+        </w:drawing>
+      </w:r>
+    </w:p>
+    <w:p>
+      <w:r>
+        <w:rPr>
+          <w:rFonts w:ascii="Calibri" w:hAnsi="Calibri"/>
+          <w:b w:val="0"/>
+          <w:i w:val="0"/>
+          <w:sz w:val="22"/>
+        </w:rPr>
+      </w:r>
+    </w:p>
+    <w:p>
+      <w:pPr>
+        <w:pStyle w:val="Heading2"/>
+      </w:pPr>
+      <w:r>
+        <w:rPr>
+          <w:b/>
+          <w:color w:val="2E2E2E"/>
+          <w:sz w:val="26"/>
+        </w:rPr>
+        <w:t>19.2 Key Findings from Progressive Build-Up</w:t>
+      </w:r>
+    </w:p>
+    <w:p>
+      <w:r>
+        <w:rPr>
+          <w:rFonts w:ascii="Calibri" w:hAnsi="Calibri"/>
+          <w:b w:val="0"/>
+          <w:i w:val="0"/>
+          <w:sz w:val="22"/>
+        </w:rPr>
+        <w:t>Dual AF is the single most important change, adding +34.1 percentage points to the OVR baseline. Without dual AF's ability to track evidence both for and against each class, the binary OVR models lack the discriminative foundation needed by all subsequent improvements.</w:t>
+      </w:r>
+    </w:p>
+    <w:p>
+      <w:r>
+        <w:rPr>
+          <w:rFonts w:ascii="Calibri" w:hAnsi="Calibri"/>
+          <w:b w:val="0"/>
+          <w:i w:val="0"/>
+          <w:sz w:val="22"/>
+        </w:rPr>
+        <w:t>Healthy bar thresholding drops performance by -12.8 points when added after dual AF and Fisher but before ratio scoring. This critical finding demonstrates that healthy bar requires ratio scoring to function properly — the adaptive thresholds were designed for ratio-scaled evidence, not raw AF scores. Once ratio scoring is added, the pair together produces a dramatic +19.7 point recovery.</w:t>
+      </w:r>
+    </w:p>
+    <w:p>
+      <w:r>
+        <w:rPr>
+          <w:rFonts w:ascii="Calibri" w:hAnsi="Calibri"/>
+          <w:b w:val="0"/>
+          <w:i w:val="0"/>
+          <w:sz w:val="22"/>
+        </w:rPr>
+        <w:t>Class removal adds +5.7 points, showing that removing classes {7, 8, 11, 12, 13} is effective once the algorithm has sufficient discriminative power. In isolation, class removal hurts (-3.0 vs OVR baseline) because the algorithm cannot leverage the cleaned dataset without proper evidence tracking and scoring.</w:t>
+      </w:r>
+    </w:p>
+    <w:p>
+      <w:r>
+        <w:rPr>
+          <w:rFonts w:ascii="Calibri" w:hAnsi="Calibri"/>
+          <w:b w:val="0"/>
+          <w:i w:val="0"/>
+          <w:sz w:val="22"/>
+        </w:rPr>
+        <w:t>Supervised binning adds +4.1 points near the end of the build-up, despite degrading performance by -1.7 points when applied alone. The chi-squared bins require the full evidence pipeline (dual AF + Fisher + ratio + healthy bar) and feature selection to create meaningful discriminative boundaries. Without these, supervised bins introduce noise from overfitting to sparse class distributions.</w:t>
+      </w:r>
+    </w:p>
+    <w:p>
+      <w:r>
+        <w:rPr>
+          <w:rFonts w:ascii="Calibri" w:hAnsi="Calibri"/>
+          <w:b w:val="0"/>
+          <w:i w:val="0"/>
+          <w:sz w:val="22"/>
+        </w:rPr>
+        <w:t>Laplace smoothing adds a final +0.7 points, preventing zero-count bins created by supervised binning from blocking evidence accumulation. This change is only meaningful in the presence of supervised binning — without it, Sturges' uniform bins rarely produce empty bins.</w:t>
+      </w:r>
+    </w:p>
+    <w:p>
+      <w:pPr>
+        <w:pStyle w:val="Heading2"/>
+      </w:pPr>
+      <w:r>
+        <w:rPr>
+          <w:b/>
+          <w:color w:val="2E2E2E"/>
+          <w:sz w:val="26"/>
+        </w:rPr>
+        <w:t>19.3 Dependency Structure</w:t>
+      </w:r>
+    </w:p>
+    <w:p>
+      <w:r>
+        <w:rPr>
+          <w:rFonts w:ascii="Calibri" w:hAnsi="Calibri"/>
+          <w:b w:val="0"/>
+          <w:i w:val="0"/>
+          <w:sz w:val="22"/>
+        </w:rPr>
+        <w:t>The progressive analysis reveals a clear dependency structure:</w:t>
       </w:r>
     </w:p>
     <w:p>
@@ -4256,7 +6585,7 @@
           <w:rFonts w:ascii="Calibri" w:hAnsi="Calibri"/>
           <w:sz w:val="22"/>
         </w:rPr>
-        <w:t>Dual AF Evidence Tracking: +34.1%</w:t>
+        <w:t>Foundation: Dual AF (must come first — enables everything else)</w:t>
       </w:r>
     </w:p>
     <w:p>
@@ -4268,7 +6597,7 @@
           <w:rFonts w:ascii="Calibri" w:hAnsi="Calibri"/>
           <w:sz w:val="22"/>
         </w:rPr>
-        <w:t>Healthy Bar Thresholding: +38.5%</w:t>
+        <w:t>Evidence quality: Fisher weighting (amplifies dual AF's signal)</w:t>
       </w:r>
     </w:p>
     <w:p>
@@ -4280,7 +6609,31 @@
           <w:rFonts w:ascii="Calibri" w:hAnsi="Calibri"/>
           <w:sz w:val="22"/>
         </w:rPr>
-        <w:t>Per-Class Thresholds: +25.7%</w:t>
+        <w:t>Decision system: Ratio scoring + Healthy bar (must be added together)</w:t>
+      </w:r>
+    </w:p>
+    <w:p>
+      <w:pPr>
+        <w:pStyle w:val="ListBullet"/>
+      </w:pPr>
+      <w:r>
+        <w:rPr>
+          <w:rFonts w:ascii="Calibri" w:hAnsi="Calibri"/>
+          <w:sz w:val="22"/>
+        </w:rPr>
+        <w:t>Data cleanup: Feature selection + Class removal (effective only with strong evidence)</w:t>
+      </w:r>
+    </w:p>
+    <w:p>
+      <w:pPr>
+        <w:pStyle w:val="ListBullet"/>
+      </w:pPr>
+      <w:r>
+        <w:rPr>
+          <w:rFonts w:ascii="Calibri" w:hAnsi="Calibri"/>
+          <w:sz w:val="22"/>
+        </w:rPr>
+        <w:t>Fine-tuning: Class thresholds + Rare class params + Supervised binning + Laplace</w:t>
       </w:r>
     </w:p>
     <w:p>
@@ -4291,7 +6644,90 @@
           <w:i w:val="0"/>
           <w:sz w:val="22"/>
         </w:rPr>
-        <w:t>Yet no single change accounts for the final result. The combined algorithm's 86.8% peak accuracy substantially exceeds what would be predicted by summing individual gains, underscoring that synergy between architectural, representational, evidentiary, scoring, and decision-making improvements — not any one modification — is what ultimately drives the algorithm's performance.</w:t>
+        <w:t>This dependency chain explains why individual changes often degrade performance: each change was designed for a specific context that only exists when its prerequisites are in place. The algorithm's final 86.8% accuracy emerges not from any single improvement but from the careful layering of interdependent components.</w:t>
+      </w:r>
+    </w:p>
+    <w:p>
+      <w:pPr>
+        <w:pStyle w:val="Heading1"/>
+      </w:pPr>
+      <w:r>
+        <w:rPr>
+          <w:b/>
+          <w:color w:val="1F2D5C"/>
+          <w:sz w:val="32"/>
+        </w:rPr>
+        <w:t>20. Conclusion</w:t>
+      </w:r>
+    </w:p>
+    <w:p>
+      <w:r>
+        <w:rPr>
+          <w:rFonts w:ascii="Calibri" w:hAnsi="Calibri"/>
+          <w:b w:val="0"/>
+          <w:i w:val="0"/>
+          <w:sz w:val="22"/>
+        </w:rPr>
+        <w:t>This incremental study demonstrates that a Bayesian arrhythmia classifier can be systematically improved from roughly 50% to over 86% peak 10-fold CV multiclass accuracy through a sequence of interdependent, well-motivated changes. The progressive build-up analysis reveals that the path from 28.5% (OVR baseline) to 86.8% (final system) follows a clear dependency chain:</w:t>
+      </w:r>
+    </w:p>
+    <w:p>
+      <w:pPr>
+        <w:pStyle w:val="ListBullet"/>
+      </w:pPr>
+      <w:r>
+        <w:rPr>
+          <w:rFonts w:ascii="Calibri" w:hAnsi="Calibri"/>
+          <w:sz w:val="22"/>
+        </w:rPr>
+        <w:t>Dual AF is the foundation (+34.1 points) — all other improvements build on it</w:t>
+      </w:r>
+    </w:p>
+    <w:p>
+      <w:pPr>
+        <w:pStyle w:val="ListBullet"/>
+      </w:pPr>
+      <w:r>
+        <w:rPr>
+          <w:rFonts w:ascii="Calibri" w:hAnsi="Calibri"/>
+          <w:sz w:val="22"/>
+        </w:rPr>
+        <w:t>The scoring pipeline (ratio + healthy bar) must be added together (+19.7 combined)</w:t>
+      </w:r>
+    </w:p>
+    <w:p>
+      <w:pPr>
+        <w:pStyle w:val="ListBullet"/>
+      </w:pPr>
+      <w:r>
+        <w:rPr>
+          <w:rFonts w:ascii="Calibri" w:hAnsi="Calibri"/>
+          <w:sz w:val="22"/>
+        </w:rPr>
+        <w:t>Class management (removal + rare params + thresholds) requires strong evidence first</w:t>
+      </w:r>
+    </w:p>
+    <w:p>
+      <w:pPr>
+        <w:pStyle w:val="ListBullet"/>
+      </w:pPr>
+      <w:r>
+        <w:rPr>
+          <w:rFonts w:ascii="Calibri" w:hAnsi="Calibri"/>
+          <w:sz w:val="22"/>
+        </w:rPr>
+        <w:t>Supervised binning only helps (+4.1) when the full evidence pipeline is in place</w:t>
+      </w:r>
+    </w:p>
+    <w:p>
+      <w:r>
+        <w:rPr>
+          <w:rFonts w:ascii="Calibri" w:hAnsi="Calibri"/>
+          <w:b w:val="0"/>
+          <w:i w:val="0"/>
+          <w:sz w:val="22"/>
+        </w:rPr>
+        <w:t>The synergy analysis confirms that changes which degrade performance in isolation (supervised binning: -1.7%, class removal: -3.0%, ratio scoring: -20.0%) become essential contributors when combined with their prerequisites. The strongest pairwise synergy is Dual AF + Fisher (67.0%), exceeding either alone (62.6% and 63.3%). The final system's 86.8% accuracy is not the sum of individual gains but the product of carefully layered, mutually reinforcing components — each designed for a context that only exists when its prerequisites are in place.</w:t>
       </w:r>
     </w:p>
     <w:sectPr>

</xml_diff>